<commit_message>
Complete CSD325 Module 1.2 screenshots
</commit_message>
<xml_diff>
--- a/module-1/Stanback-Assignment1_2.docx
+++ b/module-1/Stanback-Assignment1_2.docx
@@ -400,6 +400,55 @@
           <w:color w:val="000000" w:themeColor="text1"/>
         </w:rPr>
       </w:pPr>
+      <w:r>
+        <w:rPr>
+          <w:noProof/>
+          <w:color w:val="000000" w:themeColor="text1"/>
+          <w14:ligatures w14:val="standardContextual"/>
+        </w:rPr>
+        <w:lastRenderedPageBreak/>
+        <w:drawing>
+          <wp:inline distT="0" distB="0" distL="0" distR="0" wp14:anchorId="70F3DF18" wp14:editId="5A392224">
+            <wp:extent cx="5943600" cy="3324225"/>
+            <wp:effectExtent l="0" t="0" r="0" b="3175"/>
+            <wp:docPr id="983056105" name="Picture 2"/>
+            <wp:cNvGraphicFramePr>
+              <a:graphicFrameLocks xmlns:a="http://schemas.openxmlformats.org/drawingml/2006/main" noChangeAspect="1"/>
+            </wp:cNvGraphicFramePr>
+            <a:graphic xmlns:a="http://schemas.openxmlformats.org/drawingml/2006/main">
+              <a:graphicData uri="http://schemas.openxmlformats.org/drawingml/2006/picture">
+                <pic:pic xmlns:pic="http://schemas.openxmlformats.org/drawingml/2006/picture">
+                  <pic:nvPicPr>
+                    <pic:cNvPr id="983056105" name="Picture 983056105"/>
+                    <pic:cNvPicPr/>
+                  </pic:nvPicPr>
+                  <pic:blipFill>
+                    <a:blip r:embed="rId5" cstate="print">
+                      <a:extLst>
+                        <a:ext uri="{28A0092B-C50C-407E-A947-70E740481C1C}">
+                          <a14:useLocalDpi xmlns:a14="http://schemas.microsoft.com/office/drawing/2010/main" val="0"/>
+                        </a:ext>
+                      </a:extLst>
+                    </a:blip>
+                    <a:stretch>
+                      <a:fillRect/>
+                    </a:stretch>
+                  </pic:blipFill>
+                  <pic:spPr>
+                    <a:xfrm>
+                      <a:off x="0" y="0"/>
+                      <a:ext cx="5943600" cy="3324225"/>
+                    </a:xfrm>
+                    <a:prstGeom prst="rect">
+                      <a:avLst/>
+                    </a:prstGeom>
+                  </pic:spPr>
+                </pic:pic>
+              </a:graphicData>
+            </a:graphic>
+          </wp:inline>
+        </w:drawing>
+      </w:r>
     </w:p>
     <w:p/>
     <w:sectPr>

</xml_diff>